<commit_message>
Datasets de MP sin la lista de trampas («Sembrados») en el LÉAME ni en el brief
Co-Authored-By: Claude Opus 5.5 <noreply@anthropic.com>
</commit_message>
<xml_diff>
--- a/datasets/mp/03 Brief creativo campaña Navidad - ficticio.docx
+++ b/datasets/mp/03 Brief creativo campaña Navidad - ficticio.docx
@@ -278,11 +278,6 @@
     <w:p>
       <w:r>
         <w:t>1) Modo plan: «No escriba nada todavía; hágame las preguntas que le faltan para producir las piezas». 2) Pedirle que revise el brief y liste vacíos y contradicciones antes de crear. 3) Proponer la portada (texto e indicaciones de imagen) y 3 titulares, con un loop redactor/revisor contra las restricciones de la sección 8.</w:t>
-      </w:r>
-    </w:p>
-    <w:p>
-      <w:r>
-        <w:t>Sembrados a propósito: el objetivo no tiene cifra ni forma de medirse; el público no distingue asesora de clienta final; la primera versión de piezas (31-oct) es anterior a la aprobación del brief (3-nov); el precio especial de los tenis urbanos ($99.900) no coincide con el maestro de referencias ($139.900) y no dice si es descuento; «regalos desde $19.900» depende de un desodorante que no está entre las protagonistas.</w:t>
       </w:r>
     </w:p>
     <w:sectPr>

</xml_diff>